<commit_message>
Reorganize repo for presentation: numbered notebooks, results/, scripts/, docs, new README
Co-authored-by: Copilot <223556219+Copilot@users.noreply.github.com>
</commit_message>
<xml_diff>
--- a/reports/segmentation_and_pipeline_results_report.docx
+++ b/reports/segmentation_and_pipeline_results_report.docx
@@ -6919,42 +6919,42 @@
     </w:p>
     <w:p>
       <w:r>
-        <w:t>S2. Fixed-split cross-model comparison: D:/Reasearch/Resnet50test/unet_vs_deeplabv3_comparison_v2.csv</w:t>
+        <w:t>S2. Fixed-split cross-model comparison: D:/Reasearch/Resnet50test/results/unet_vs_deeplabv3_comparison_v2.csv</w:t>
       </w:r>
     </w:p>
     <w:p>
       <w:r>
-        <w:t>S3. U-Net fixed-split pipeline predictions: D:/Reasearch/Unet/outputs/fusion_pipeline/full_pipeline_test_results.csv</w:t>
+        <w:t>S3. U-Net fixed-split pipeline predictions: D:/Reasearch/Unet/results/fusion_pipeline/full_pipeline_test_results.csv</w:t>
       </w:r>
     </w:p>
     <w:p>
       <w:r>
-        <w:t>S4. U-Net segmentation fold metrics: D:/Reasearch/Unet/outputs/cross_validation/unet_segmentation_cv_results.csv</w:t>
+        <w:t>S4. U-Net segmentation fold metrics: D:/Reasearch/Unet/results/cross_validation/unet_segmentation_cv_results.csv</w:t>
       </w:r>
     </w:p>
     <w:p>
       <w:r>
-        <w:t>S5. DeepLabV3 segmenter-only CV: D:/Reasearch/Resnet50test/checkpoints_segmentation/deeplabv3_kfold_cv_results.csv</w:t>
+        <w:t>S5. DeepLabV3 segmenter-only CV: D:/Reasearch/Resnet50test/results/deeplabv3_kfold_cv_results.csv</w:t>
       </w:r>
     </w:p>
     <w:p>
       <w:r>
-        <w:t>S6. DeepLabV3 full-pipeline CV: D:/Reasearch/Resnet50test/deeplabv3_pipeline_kfold_cv_results.csv</w:t>
+        <w:t>S6. DeepLabV3 full-pipeline CV: D:/Reasearch/Resnet50test/results/deeplabv3_pipeline_kfold_cv_results.csv</w:t>
       </w:r>
     </w:p>
     <w:p>
       <w:r>
-        <w:t>S7. DeepLabV3 training and CV notebook: D:/Reasearch/Resnet50test/leaf_segmentation.ipynb</w:t>
+        <w:t>S7. DeepLabV3 training and CV notebook: D:/Reasearch/Resnet50test/notebooks/03_deeplabv3_segmentation_pipeline.ipynb</w:t>
       </w:r>
     </w:p>
     <w:p>
       <w:r>
-        <w:t>S8. DeepLabV3 standalone pipeline recomputation: D:/Reasearch/Resnet50test/deeplabv3_pipeline_evaluation.ipynb</w:t>
+        <w:t>S8. DeepLabV3 standalone pipeline recomputation: D:/Reasearch/Resnet50test/notebooks/05_deeplabv3_pipeline_evaluation.ipynb</w:t>
       </w:r>
     </w:p>
     <w:p>
       <w:r>
-        <w:t>S9. U-Net CV notebook: D:/Reasearch/Unet/unet_cross_validation.ipynb</w:t>
+        <w:t>S9. U-Net CV notebook: D:/Reasearch/Unet/notebooks/03_unet_cross_validation.ipynb</w:t>
       </w:r>
     </w:p>
     <w:p>
@@ -6964,7 +6964,7 @@
     </w:p>
     <w:p>
       <w:r>
-        <w:t>S11. U-Net pipeline fold metrics: D:/Reasearch/Unet/outputs/cross_validation/fusion_pipeline_cv_results.csv</w:t>
+        <w:t>S11. U-Net pipeline fold metrics: D:/Reasearch/Unet/results/cross_validation/fusion_pipeline_cv_results.csv</w:t>
       </w:r>
     </w:p>
     <w:p>

</xml_diff>